<commit_message>
Publish 2026-mod2: 17 files
Co-Authored-By: Claude Fable 5.1 <noreply@anthropic.com>
</commit_message>
<xml_diff>
--- a/2026-mod2/general/MAR6930_2026_MOD2_Syllabus.docx
+++ b/2026-mod2/general/MAR6930_2026_MOD2_Syllabus.docx
@@ -170,7 +170,6 @@
         <w:ind w:left="360"/>
       </w:pPr>
       <w:r>
-        <w:lastRenderedPageBreak/>
         <w:t>•  Use AI-assisted tools to build and customize high-quality visualizations while understanding the underlying data-shaping and plotting steps.</w:t>
       </w:r>
     </w:p>
@@ -250,7 +249,25 @@
     </w:p>
     <w:p>
       <w:r>
-        <w:t>The two in-class open-book exams test students' understanding of the course materials. Exam 1 is held in Week 3 and Exam 2 in Week 7 in class. Any</w:t>
+        <w:t xml:space="preserve">The two in-class open-book exams test students' understanding of the course materials. Exam 1 is held in Week </w:t>
+      </w:r>
+      <w:r>
+        <w:rPr>
+          <w:rFonts w:cs="Times New Roman"/>
+        </w:rPr>
+        <w:t>4</w:t>
+      </w:r>
+      <w:r>
+        <w:t xml:space="preserve"> and Exam 2 in Week </w:t>
+      </w:r>
+      <w:r>
+        <w:rPr>
+          <w:rFonts w:cs="Times New Roman"/>
+        </w:rPr>
+        <w:t>8</w:t>
+      </w:r>
+      <w:r>
+        <w:t xml:space="preserve"> in class. Any</w:t>
       </w:r>
       <w:r>
         <w:rPr>
@@ -297,8 +314,11 @@
     </w:p>
     <w:p>
       <w:r>
+        <w:t xml:space="preserve">Students will be graded by the quality, not the quantity, of their participation. Students are encouraged to speak up whenever they have a point of view that is appropriate in the context of ongoing discussion thread. Once the discussion has organically moved forward from one </w:t>
+      </w:r>
+      <w:r>
         <w:lastRenderedPageBreak/>
-        <w:t>Students will be graded by the quality, not the quantity, of their participation. Students are encouraged to speak up whenever they have a point of view that is appropriate in the context of ongoing discussion thread. Once the discussion has organically moved forward from one discussion thread to the next, students must desist from taking the discussion backward, especially if such a move will not enrich the class discussion at that point. Students are welcome to discuss those points offline.</w:t>
+        <w:t>discussion thread to the next, students must desist from taking the discussion backward, especially if such a move will not enrich the class discussion at that point. Students are welcome to discuss those points offline.</w:t>
       </w:r>
     </w:p>
     <w:p>
@@ -585,8 +605,11 @@
     </w:p>
     <w:p>
       <w:r>
+        <w:t xml:space="preserve">Because the course relies heavily on the instructor's lecturing and in-class exercises, it will be important to attend the class in order to get the most of this course. If you should need to be absent from a class, you need to contact me before the class. The attendance policy will be </w:t>
+      </w:r>
+      <w:r>
         <w:lastRenderedPageBreak/>
-        <w:t>Because the course relies heavily on the instructor's lecturing and in-class exercises, it will be important to attend the class in order to get the most of this course. If you should need to be absent from a class, you need to contact me before the class. The attendance policy will be consistent with the university's. For more information, see https://catalog.ufl.edu/UGRD/academic-regulations/attendance-policies/.</w:t>
+        <w:t>consistent with the university's. For more information, see https://catalog.ufl.edu/UGRD/academic-regulations/attendance-policies/.</w:t>
       </w:r>
     </w:p>
     <w:p>
@@ -624,7 +647,7 @@
       <w:tr>
         <w:tc>
           <w:tcPr>
-            <w:tcW w:w="3120" w:type="dxa"/>
+            <w:tcW w:w="3115" w:type="dxa"/>
           </w:tcPr>
           <w:p>
             <w:r>
@@ -634,7 +657,7 @@
         </w:tc>
         <w:tc>
           <w:tcPr>
-            <w:tcW w:w="3120" w:type="dxa"/>
+            <w:tcW w:w="3117" w:type="dxa"/>
           </w:tcPr>
           <w:p>
             <w:r>
@@ -644,7 +667,7 @@
         </w:tc>
         <w:tc>
           <w:tcPr>
-            <w:tcW w:w="3120" w:type="dxa"/>
+            <w:tcW w:w="3118" w:type="dxa"/>
           </w:tcPr>
           <w:p>
             <w:r>
@@ -656,7 +679,7 @@
       <w:tr>
         <w:tc>
           <w:tcPr>
-            <w:tcW w:w="3120" w:type="dxa"/>
+            <w:tcW w:w="3115" w:type="dxa"/>
           </w:tcPr>
           <w:p>
             <w:r>
@@ -666,17 +689,20 @@
         </w:tc>
         <w:tc>
           <w:tcPr>
-            <w:tcW w:w="3120" w:type="dxa"/>
-          </w:tcPr>
-          <w:p>
-            <w:r>
-              <w:t>Class introduction and logistics; principles of visual design</w:t>
-            </w:r>
-          </w:p>
-        </w:tc>
-        <w:tc>
-          <w:tcPr>
-            <w:tcW w:w="3120" w:type="dxa"/>
+            <w:tcW w:w="3117" w:type="dxa"/>
+          </w:tcPr>
+          <w:p>
+            <w:r>
+              <w:t xml:space="preserve">Class introduction and logistics; </w:t>
+            </w:r>
+            <w:r>
+              <w:t>software setup</w:t>
+            </w:r>
+          </w:p>
+        </w:tc>
+        <w:tc>
+          <w:tcPr>
+            <w:tcW w:w="3118" w:type="dxa"/>
           </w:tcPr>
           <w:p/>
         </w:tc>
@@ -684,7 +710,7 @@
       <w:tr>
         <w:tc>
           <w:tcPr>
-            <w:tcW w:w="3120" w:type="dxa"/>
+            <w:tcW w:w="3115" w:type="dxa"/>
           </w:tcPr>
           <w:p>
             <w:r>
@@ -694,17 +720,23 @@
         </w:tc>
         <w:tc>
           <w:tcPr>
-            <w:tcW w:w="3120" w:type="dxa"/>
-          </w:tcPr>
-          <w:p>
-            <w:r>
-              <w:t>Explorative visualization: data-processing basics; getting familiar with the AI-assisted, code-based visualization interface</w:t>
-            </w:r>
-          </w:p>
-        </w:tc>
-        <w:tc>
-          <w:tcPr>
-            <w:tcW w:w="3120" w:type="dxa"/>
+            <w:tcW w:w="3117" w:type="dxa"/>
+          </w:tcPr>
+          <w:p>
+            <w:r>
+              <w:t>principles of visual design</w:t>
+            </w:r>
+            <w:r>
+              <w:t xml:space="preserve">; </w:t>
+            </w:r>
+            <w:r>
+              <w:t>Explorative visualization: data-processing basics</w:t>
+            </w:r>
+          </w:p>
+        </w:tc>
+        <w:tc>
+          <w:tcPr>
+            <w:tcW w:w="3118" w:type="dxa"/>
           </w:tcPr>
           <w:p/>
         </w:tc>
@@ -712,7 +744,7 @@
       <w:tr>
         <w:tc>
           <w:tcPr>
-            <w:tcW w:w="3120" w:type="dxa"/>
+            <w:tcW w:w="3115" w:type="dxa"/>
           </w:tcPr>
           <w:p>
             <w:r>
@@ -722,29 +754,28 @@
         </w:tc>
         <w:tc>
           <w:tcPr>
-            <w:tcW w:w="3120" w:type="dxa"/>
-          </w:tcPr>
-          <w:p>
-            <w:r>
-              <w:t>In-class Exam 1; firm performance (time-series, A/B testing)</w:t>
-            </w:r>
-          </w:p>
-        </w:tc>
-        <w:tc>
-          <w:tcPr>
-            <w:tcW w:w="3120" w:type="dxa"/>
-          </w:tcPr>
-          <w:p>
-            <w:r>
-              <w:t>Exam 1 (in class)</w:t>
-            </w:r>
-          </w:p>
+            <w:tcW w:w="3117" w:type="dxa"/>
+          </w:tcPr>
+          <w:p>
+            <w:r>
+              <w:t>F</w:t>
+            </w:r>
+            <w:r>
+              <w:t>irm performance (time-series, A/B testing)</w:t>
+            </w:r>
+          </w:p>
+        </w:tc>
+        <w:tc>
+          <w:tcPr>
+            <w:tcW w:w="3118" w:type="dxa"/>
+          </w:tcPr>
+          <w:p/>
         </w:tc>
       </w:tr>
       <w:tr>
         <w:tc>
           <w:tcPr>
-            <w:tcW w:w="3120" w:type="dxa"/>
+            <w:tcW w:w="3115" w:type="dxa"/>
           </w:tcPr>
           <w:p>
             <w:r>
@@ -754,7 +785,7 @@
         </w:tc>
         <w:tc>
           <w:tcPr>
-            <w:tcW w:w="3120" w:type="dxa"/>
+            <w:tcW w:w="3117" w:type="dxa"/>
           </w:tcPr>
           <w:p>
             <w:r>
@@ -764,15 +795,19 @@
         </w:tc>
         <w:tc>
           <w:tcPr>
-            <w:tcW w:w="3120" w:type="dxa"/>
-          </w:tcPr>
-          <w:p/>
+            <w:tcW w:w="3118" w:type="dxa"/>
+          </w:tcPr>
+          <w:p>
+            <w:r>
+              <w:t>Exam 1 (in class)</w:t>
+            </w:r>
+          </w:p>
         </w:tc>
       </w:tr>
       <w:tr>
         <w:tc>
           <w:tcPr>
-            <w:tcW w:w="3120" w:type="dxa"/>
+            <w:tcW w:w="3115" w:type="dxa"/>
           </w:tcPr>
           <w:p>
             <w:r>
@@ -782,7 +817,7 @@
         </w:tc>
         <w:tc>
           <w:tcPr>
-            <w:tcW w:w="3120" w:type="dxa"/>
+            <w:tcW w:w="3117" w:type="dxa"/>
           </w:tcPr>
           <w:p>
             <w:r>
@@ -792,7 +827,7 @@
         </w:tc>
         <w:tc>
           <w:tcPr>
-            <w:tcW w:w="3120" w:type="dxa"/>
+            <w:tcW w:w="3118" w:type="dxa"/>
           </w:tcPr>
           <w:p/>
         </w:tc>
@@ -800,7 +835,7 @@
       <w:tr>
         <w:tc>
           <w:tcPr>
-            <w:tcW w:w="3120" w:type="dxa"/>
+            <w:tcW w:w="3115" w:type="dxa"/>
           </w:tcPr>
           <w:p>
             <w:r>
@@ -810,7 +845,7 @@
         </w:tc>
         <w:tc>
           <w:tcPr>
-            <w:tcW w:w="3120" w:type="dxa"/>
+            <w:tcW w:w="3117" w:type="dxa"/>
           </w:tcPr>
           <w:p>
             <w:r>
@@ -829,7 +864,7 @@
         </w:tc>
         <w:tc>
           <w:tcPr>
-            <w:tcW w:w="3120" w:type="dxa"/>
+            <w:tcW w:w="3118" w:type="dxa"/>
           </w:tcPr>
           <w:p/>
         </w:tc>
@@ -837,17 +872,48 @@
       <w:tr>
         <w:tc>
           <w:tcPr>
-            <w:tcW w:w="3120" w:type="dxa"/>
-          </w:tcPr>
-          <w:p>
-            <w:r>
-              <w:t>Week 7 (Nov 30 &amp; Dec 2)</w:t>
-            </w:r>
-          </w:p>
-        </w:tc>
-        <w:tc>
-          <w:tcPr>
-            <w:tcW w:w="3120" w:type="dxa"/>
+            <w:tcW w:w="3115" w:type="dxa"/>
+          </w:tcPr>
+          <w:p>
+            <w:r>
+              <w:t>Week 7 (Nov 23 &amp; 25)</w:t>
+            </w:r>
+          </w:p>
+        </w:tc>
+        <w:tc>
+          <w:tcPr>
+            <w:tcW w:w="3117" w:type="dxa"/>
+          </w:tcPr>
+          <w:p>
+            <w:r>
+              <w:t>Thanksgiving Break (no class)</w:t>
+            </w:r>
+          </w:p>
+        </w:tc>
+        <w:tc>
+          <w:tcPr>
+            <w:tcW w:w="3118" w:type="dxa"/>
+          </w:tcPr>
+          <w:p/>
+        </w:tc>
+      </w:tr>
+      <w:tr>
+        <w:tc>
+          <w:tcPr>
+            <w:tcW w:w="3115" w:type="dxa"/>
+          </w:tcPr>
+          <w:p>
+            <w:r>
+              <w:t>Week 8</w:t>
+            </w:r>
+            <w:r>
+              <w:t xml:space="preserve"> (Nov 30 &amp; Dec 2)</w:t>
+            </w:r>
+          </w:p>
+        </w:tc>
+        <w:tc>
+          <w:tcPr>
+            <w:tcW w:w="3117" w:type="dxa"/>
           </w:tcPr>
           <w:p>
             <w:r>
@@ -857,11 +923,20 @@
         </w:tc>
         <w:tc>
           <w:tcPr>
-            <w:tcW w:w="3120" w:type="dxa"/>
-          </w:tcPr>
-          <w:p>
-            <w:r>
-              <w:t>Exam 2 (in class); project presentations</w:t>
+            <w:tcW w:w="3118" w:type="dxa"/>
+          </w:tcPr>
+          <w:p>
+            <w:r>
+              <w:t>P</w:t>
+            </w:r>
+            <w:r>
+              <w:t>roject presentations</w:t>
+            </w:r>
+            <w:r>
+              <w:t xml:space="preserve">; </w:t>
+            </w:r>
+            <w:r>
+              <w:t>Exam 2 (in class);</w:t>
             </w:r>
           </w:p>
         </w:tc>
@@ -885,9 +960,31 @@
     </w:p>
     <w:p>
       <w:r>
-        <w:t xml:space="preserve">Students with disabilities requesting accommodations should first register with the Disability Resource Center (352-392-8565, www.dso.ufl.edu/drc/) by providing appropriate documentation. Once registered, students will receive an accommodation letter which must be presented to the instructor when requesting accommodation. Students with disabilities should </w:t>
+        <w:t>Students with disabilities requesting accommodations should first register with the Disability Resource Center (352-392-8565, www.dso.ufl.edu/drc/) by providing appropriate documentation. Once registered, students will receive an accommodation letter which must be presented to the instructor when requesting accommodation. Students with disabilities should follow this procedure as early as possible in the semester. For more information, see https://disability.ufl.edu/students/get-started/.</w:t>
+      </w:r>
+    </w:p>
+    <w:p>
+      <w:r>
+        <w:rPr>
+          <w:b/>
+        </w:rPr>
+        <w:t>Recording Policy</w:t>
+      </w:r>
+    </w:p>
+    <w:p>
+      <w:r>
         <w:lastRenderedPageBreak/>
-        <w:t>follow this procedure as early as possible in the semester. For more information, see https://disability.ufl.edu/students/get-started/.</w:t>
+        <w:t>Students are allowed to record video or audio of class lectures. However, the purposes for which these recordings may be used are strictly controlled. The only allowable purposes are (1) for personal educational use, (2) in connection with a complaint to the university, or (3) as evidence in, or in preparation for, a criminal or civil proceeding. All other purposes are prohibited. Specifically, students may not publish recorded lectures without the written consent of the instructor.</w:t>
+      </w:r>
+    </w:p>
+    <w:p>
+      <w:r>
+        <w:t>A "class lecture" is an educational presentation intended to inform or teach enrolled students about a particular subject, including any instructor-led discussions that form part of the presentation, and delivered by any instructor hired or appointed by the University, or by a guest instructor, as part of a University of Florida course. A class lecture does not include lab sessions, student presentations, clinical presentations such as patient history, academic exercises involving solely student participation, assessments (quizzes, tests, exams), field trips, private conversations between students in the class or between a student and the faculty or lecturer during a class session.</w:t>
+      </w:r>
+    </w:p>
+    <w:p>
+      <w:r>
+        <w:t>Publication without permission of the instructor is prohibited. To "publish" means to share, transmit, circulate, distribute, or provide access to a recording, regardless of format or medium, to another person (or persons), including but not limited to another student within the same class section. Additionally, a recording, or transcript of a recording, is considered published if it is posted on or uploaded to, in whole or in part, any media platform, including but not limited to social media, book, magazine, newspaper, leaflet, or third party note/tutoring services. A student who publishes a recording without written consent may be subject to a civil cause of action instituted by a person injured by the publication and/or discipline under UF Regulation 4.040 Student Honor Code and Student Conduct Code.</w:t>
       </w:r>
     </w:p>
     <w:p>
@@ -895,22 +992,12 @@
         <w:rPr>
           <w:b/>
         </w:rPr>
-        <w:t>Recording Policy</w:t>
-      </w:r>
-    </w:p>
-    <w:p>
-      <w:r>
-        <w:t>Students are allowed to record video or audio of class lectures. However, the purposes for which these recordings may be used are strictly controlled. The only allowable purposes are (1) for personal educational use, (2) in connection with a complaint to the university, or (3) as evidence in, or in preparation for, a criminal or civil proceeding. All other purposes are prohibited. Specifically, students may not publish recorded lectures without the written consent of the instructor.</w:t>
-      </w:r>
-    </w:p>
-    <w:p>
-      <w:r>
-        <w:t>A "class lecture" is an educational presentation intended to inform or teach enrolled students about a particular subject, including any instructor-led discussions that form part of the presentation, and delivered by any instructor hired or appointed by the University, or by a guest instructor, as part of a University of Florida course. A class lecture does not include lab sessions, student presentations, clinical presentations such as patient history, academic exercises involving solely student participation, assessments (quizzes, tests, exams), field trips, private conversations between students in the class or between a student and the faculty or lecturer during a class session.</w:t>
-      </w:r>
-    </w:p>
-    <w:p>
-      <w:r>
-        <w:t>Publication without permission of the instructor is prohibited. To "publish" means to share, transmit, circulate, distribute, or provide access to a recording, regardless of format or medium, to another person (or persons), including but not limited to another student within the same class section. Additionally, a recording, or transcript of a recording, is considered published if it is posted on or uploaded to, in whole or in part, any media platform, including but not limited to social media, book, magazine, newspaper, leaflet, or third party note/tutoring services. A student who publishes a recording without written consent may be subject to a civil cause of action instituted by a person injured by the publication and/or discipline under UF Regulation 4.040 Student Honor Code and Student Conduct Code.</w:t>
+        <w:t>Course Evaluation</w:t>
+      </w:r>
+    </w:p>
+    <w:p>
+      <w:r>
+        <w:t>Students are expected to provide feedback on the quality of instruction in this course by completing online evaluations at https://evaluations.ufl.edu. Evaluations are typically open during the last two or three weeks of the semester, but students will be given specific times when they are open. Summary results of these assessments are available to students at https://evaluations.ufl.edu/results/.</w:t>
       </w:r>
     </w:p>
     <w:p>
@@ -918,31 +1005,22 @@
         <w:rPr>
           <w:b/>
         </w:rPr>
-        <w:t>Course Evaluation</w:t>
-      </w:r>
-    </w:p>
-    <w:p>
-      <w:r>
-        <w:t>Students are expected to provide feedback on the quality of instruction in this course by completing online evaluations at https://evaluations.ufl.edu. Evaluations are typically open during the last two or three weeks of the semester, but students will be given specific times when they are open. Summary results of these assessments are available to students at https://evaluations.ufl.edu/results/.</w:t>
-      </w:r>
-    </w:p>
-    <w:p>
-      <w:r>
-        <w:rPr>
-          <w:b/>
-        </w:rPr>
         <w:t>Academic Integrity</w:t>
       </w:r>
     </w:p>
     <w:p>
       <w:r>
-        <w:t xml:space="preserve">UF students are bound by The Honor Pledge which states, "We, the members of the University of Florida community, pledge to hold ourselves and our peers to the highest standards of honor and integrity by abiding by the Honor Code. On all work submitted for credit by students at the University of Florida, the following pledge is either required or implied: On my honor, I have neither given nor received unauthorized aid in doing this assignment." The Honor Code (http://www.dso.ufl.edu/sccr/process/student-conduct-honorcode/) specifies a number of </w:t>
-        <w:lastRenderedPageBreak/>
-        <w:t>behaviors that are in violation of this code and the possible sanctions. Furthermore, you are obligated to report any condition that facilitates academic misconduct to appropriate personnel. If you have any questions or concerns, please consult with the instructor in this class.</w:t>
+        <w:t>UF students are bound by The Honor Pledge which states, "We, the members of the University of Florida community, pledge to hold ourselves and our peers to the highest standards of honor and integrity by abiding by the Honor Code. On all work submitted for credit by students at the University of Florida, the following pledge is either required or implied: On my honor, I have neither given nor received unauthorized aid in doing this assignment." The Honor Code (http://www.dso.ufl.edu/sccr/process/student-conduct-honorcode/) specifies a number of behaviors that are in violation of this code and the possible sanctions. Furthermore, you are obligated to report any condition that facilitates academic misconduct to appropriate personnel. If you have any questions or concerns, please consult with the instructor in this class.</w:t>
       </w:r>
     </w:p>
     <w:p/>
     <w:sectPr>
+      <w:headerReference w:type="even" r:id="rId8"/>
+      <w:headerReference w:type="default" r:id="rId9"/>
+      <w:footerReference w:type="even" r:id="rId10"/>
+      <w:footerReference w:type="default" r:id="rId11"/>
+      <w:headerReference w:type="first" r:id="rId12"/>
+      <w:footerReference w:type="first" r:id="rId13"/>
       <w:pgSz w:w="12240" w:h="15840"/>
       <w:pgMar w:top="1440" w:right="1440" w:bottom="1440" w:left="1440" w:header="720" w:footer="720" w:gutter="0"/>
       <w:cols w:space="720"/>
@@ -950,6 +1028,116 @@
     </w:sectPr>
   </w:body>
 </w:document>
+</file>
+
+<file path=word/endnotes.xml><?xml version="1.0" encoding="utf-8"?>
+<w:endnotes xmlns:wpc="http://schemas.microsoft.com/office/word/2010/wordprocessingCanvas" xmlns:cx="http://schemas.microsoft.com/office/drawing/2014/chartex" xmlns:cx1="http://schemas.microsoft.com/office/drawing/2015/9/8/chartex" xmlns:cx2="http://schemas.microsoft.com/office/drawing/2015/10/21/chartex" xmlns:cx3="http://schemas.microsoft.com/office/drawing/2016/5/9/chartex" xmlns:cx4="http://schemas.microsoft.com/office/drawing/2016/5/10/chartex" xmlns:cx5="http://schemas.microsoft.com/office/drawing/2016/5/11/chartex" xmlns:cx6="http://schemas.microsoft.com/office/drawing/2016/5/12/chartex" xmlns:cx7="http://schemas.microsoft.com/office/drawing/2016/5/13/chartex" xmlns:cx8="http://schemas.microsoft.com/office/drawing/2016/5/14/chartex" xmlns:mc="http://schemas.openxmlformats.org/markup-compatibility/2006" xmlns:aink="http://schemas.microsoft.com/office/drawing/2016/ink" xmlns:am3d="http://schemas.microsoft.com/office/drawing/2017/model3d" xmlns:o="urn:schemas-microsoft-com:office:office" xmlns:oel="http://schemas.microsoft.com/office/2019/extlst" xmlns:r="http://schemas.openxmlformats.org/officeDocument/2006/relationships" xmlns:m="http://schemas.openxmlformats.org/officeDocument/2006/math" xmlns:v="urn:schemas-microsoft-com:vml" xmlns:wp14="http://schemas.microsoft.com/office/word/2010/wordprocessingDrawing" xmlns:wp="http://schemas.openxmlformats.org/drawingml/2006/wordprocessingDrawing" xmlns:w10="urn:schemas-microsoft-com:office:word" xmlns:w="http://schemas.openxmlformats.org/wordprocessingml/2006/main" xmlns:w14="http://schemas.microsoft.com/office/word/2010/wordml" xmlns:w15="http://schemas.microsoft.com/office/word/2012/wordml" xmlns:w16cex="http://schemas.microsoft.com/office/word/2018/wordml/cex" xmlns:w16cid="http://schemas.microsoft.com/office/word/2016/wordml/cid" xmlns:w16="http://schemas.microsoft.com/office/word/2018/wordml" xmlns:w16du="http://schemas.microsoft.com/office/word/2023/wordml/word16du" xmlns:w16sdtdh="http://schemas.microsoft.com/office/word/2020/wordml/sdtdatahash" xmlns:w16sdtfl="http://schemas.microsoft.com/office/word/2024/wordml/sdtformatlock" xmlns:w16se="http://schemas.microsoft.com/office/word/2015/wordml/symex" xmlns:wpg="http://schemas.microsoft.com/office/word/2010/wordprocessingGroup" xmlns:wpi="http://schemas.microsoft.com/office/word/2010/wordprocessingInk" xmlns:wne="http://schemas.microsoft.com/office/word/2006/wordml" xmlns:wps="http://schemas.microsoft.com/office/word/2010/wordprocessingShape" mc:Ignorable="w14 w15 w16se w16cid w16 w16cex w16sdtdh w16sdtfl w16du wp14">
+  <w:endnote w:type="separator" w:id="-1">
+    <w:p>
+      <w:pPr>
+        <w:spacing w:after="0" w:line="240" w:lineRule="auto"/>
+      </w:pPr>
+      <w:r>
+        <w:separator/>
+      </w:r>
+    </w:p>
+  </w:endnote>
+  <w:endnote w:type="continuationSeparator" w:id="0">
+    <w:p>
+      <w:pPr>
+        <w:spacing w:after="0" w:line="240" w:lineRule="auto"/>
+      </w:pPr>
+      <w:r>
+        <w:continuationSeparator/>
+      </w:r>
+    </w:p>
+  </w:endnote>
+</w:endnotes>
+</file>
+
+<file path=word/footer1.xml><?xml version="1.0" encoding="utf-8"?>
+<w:ftr xmlns:wpc="http://schemas.microsoft.com/office/word/2010/wordprocessingCanvas" xmlns:cx="http://schemas.microsoft.com/office/drawing/2014/chartex" xmlns:cx1="http://schemas.microsoft.com/office/drawing/2015/9/8/chartex" xmlns:cx2="http://schemas.microsoft.com/office/drawing/2015/10/21/chartex" xmlns:cx3="http://schemas.microsoft.com/office/drawing/2016/5/9/chartex" xmlns:cx4="http://schemas.microsoft.com/office/drawing/2016/5/10/chartex" xmlns:cx5="http://schemas.microsoft.com/office/drawing/2016/5/11/chartex" xmlns:cx6="http://schemas.microsoft.com/office/drawing/2016/5/12/chartex" xmlns:cx7="http://schemas.microsoft.com/office/drawing/2016/5/13/chartex" xmlns:cx8="http://schemas.microsoft.com/office/drawing/2016/5/14/chartex" xmlns:mc="http://schemas.openxmlformats.org/markup-compatibility/2006" xmlns:aink="http://schemas.microsoft.com/office/drawing/2016/ink" xmlns:am3d="http://schemas.microsoft.com/office/drawing/2017/model3d" xmlns:o="urn:schemas-microsoft-com:office:office" xmlns:oel="http://schemas.microsoft.com/office/2019/extlst" xmlns:r="http://schemas.openxmlformats.org/officeDocument/2006/relationships" xmlns:m="http://schemas.openxmlformats.org/officeDocument/2006/math" xmlns:v="urn:schemas-microsoft-com:vml" xmlns:wp14="http://schemas.microsoft.com/office/word/2010/wordprocessingDrawing" xmlns:wp="http://schemas.openxmlformats.org/drawingml/2006/wordprocessingDrawing" xmlns:w10="urn:schemas-microsoft-com:office:word" xmlns:w="http://schemas.openxmlformats.org/wordprocessingml/2006/main" xmlns:w14="http://schemas.microsoft.com/office/word/2010/wordml" xmlns:w15="http://schemas.microsoft.com/office/word/2012/wordml" xmlns:w16cex="http://schemas.microsoft.com/office/word/2018/wordml/cex" xmlns:w16cid="http://schemas.microsoft.com/office/word/2016/wordml/cid" xmlns:w16="http://schemas.microsoft.com/office/word/2018/wordml" xmlns:w16du="http://schemas.microsoft.com/office/word/2023/wordml/word16du" xmlns:w16sdtdh="http://schemas.microsoft.com/office/word/2020/wordml/sdtdatahash" xmlns:w16sdtfl="http://schemas.microsoft.com/office/word/2024/wordml/sdtformatlock" xmlns:w16se="http://schemas.microsoft.com/office/word/2015/wordml/symex" xmlns:wpg="http://schemas.microsoft.com/office/word/2010/wordprocessingGroup" xmlns:wpi="http://schemas.microsoft.com/office/word/2010/wordprocessingInk" xmlns:wne="http://schemas.microsoft.com/office/word/2006/wordml" xmlns:wps="http://schemas.microsoft.com/office/word/2010/wordprocessingShape" mc:Ignorable="w14 w15 w16se w16cid w16 w16cex w16sdtdh w16sdtfl w16du wp14">
+  <w:p>
+    <w:pPr>
+      <w:pStyle w:val="Footer"/>
+    </w:pPr>
+  </w:p>
+</w:ftr>
+</file>
+
+<file path=word/footer2.xml><?xml version="1.0" encoding="utf-8"?>
+<w:ftr xmlns:wpc="http://schemas.microsoft.com/office/word/2010/wordprocessingCanvas" xmlns:cx="http://schemas.microsoft.com/office/drawing/2014/chartex" xmlns:cx1="http://schemas.microsoft.com/office/drawing/2015/9/8/chartex" xmlns:cx2="http://schemas.microsoft.com/office/drawing/2015/10/21/chartex" xmlns:cx3="http://schemas.microsoft.com/office/drawing/2016/5/9/chartex" xmlns:cx4="http://schemas.microsoft.com/office/drawing/2016/5/10/chartex" xmlns:cx5="http://schemas.microsoft.com/office/drawing/2016/5/11/chartex" xmlns:cx6="http://schemas.microsoft.com/office/drawing/2016/5/12/chartex" xmlns:cx7="http://schemas.microsoft.com/office/drawing/2016/5/13/chartex" xmlns:cx8="http://schemas.microsoft.com/office/drawing/2016/5/14/chartex" xmlns:mc="http://schemas.openxmlformats.org/markup-compatibility/2006" xmlns:aink="http://schemas.microsoft.com/office/drawing/2016/ink" xmlns:am3d="http://schemas.microsoft.com/office/drawing/2017/model3d" xmlns:o="urn:schemas-microsoft-com:office:office" xmlns:oel="http://schemas.microsoft.com/office/2019/extlst" xmlns:r="http://schemas.openxmlformats.org/officeDocument/2006/relationships" xmlns:m="http://schemas.openxmlformats.org/officeDocument/2006/math" xmlns:v="urn:schemas-microsoft-com:vml" xmlns:wp14="http://schemas.microsoft.com/office/word/2010/wordprocessingDrawing" xmlns:wp="http://schemas.openxmlformats.org/drawingml/2006/wordprocessingDrawing" xmlns:w10="urn:schemas-microsoft-com:office:word" xmlns:w="http://schemas.openxmlformats.org/wordprocessingml/2006/main" xmlns:w14="http://schemas.microsoft.com/office/word/2010/wordml" xmlns:w15="http://schemas.microsoft.com/office/word/2012/wordml" xmlns:w16cex="http://schemas.microsoft.com/office/word/2018/wordml/cex" xmlns:w16cid="http://schemas.microsoft.com/office/word/2016/wordml/cid" xmlns:w16="http://schemas.microsoft.com/office/word/2018/wordml" xmlns:w16du="http://schemas.microsoft.com/office/word/2023/wordml/word16du" xmlns:w16sdtdh="http://schemas.microsoft.com/office/word/2020/wordml/sdtdatahash" xmlns:w16sdtfl="http://schemas.microsoft.com/office/word/2024/wordml/sdtformatlock" xmlns:w16se="http://schemas.microsoft.com/office/word/2015/wordml/symex" xmlns:wpg="http://schemas.microsoft.com/office/word/2010/wordprocessingGroup" xmlns:wpi="http://schemas.microsoft.com/office/word/2010/wordprocessingInk" xmlns:wne="http://schemas.microsoft.com/office/word/2006/wordml" xmlns:wps="http://schemas.microsoft.com/office/word/2010/wordprocessingShape" mc:Ignorable="w14 w15 w16se w16cid w16 w16cex w16sdtdh w16sdtfl w16du wp14">
+  <w:p>
+    <w:pPr>
+      <w:pStyle w:val="Footer"/>
+    </w:pPr>
+  </w:p>
+</w:ftr>
+</file>
+
+<file path=word/footer3.xml><?xml version="1.0" encoding="utf-8"?>
+<w:ftr xmlns:wpc="http://schemas.microsoft.com/office/word/2010/wordprocessingCanvas" xmlns:cx="http://schemas.microsoft.com/office/drawing/2014/chartex" xmlns:cx1="http://schemas.microsoft.com/office/drawing/2015/9/8/chartex" xmlns:cx2="http://schemas.microsoft.com/office/drawing/2015/10/21/chartex" xmlns:cx3="http://schemas.microsoft.com/office/drawing/2016/5/9/chartex" xmlns:cx4="http://schemas.microsoft.com/office/drawing/2016/5/10/chartex" xmlns:cx5="http://schemas.microsoft.com/office/drawing/2016/5/11/chartex" xmlns:cx6="http://schemas.microsoft.com/office/drawing/2016/5/12/chartex" xmlns:cx7="http://schemas.microsoft.com/office/drawing/2016/5/13/chartex" xmlns:cx8="http://schemas.microsoft.com/office/drawing/2016/5/14/chartex" xmlns:mc="http://schemas.openxmlformats.org/markup-compatibility/2006" xmlns:aink="http://schemas.microsoft.com/office/drawing/2016/ink" xmlns:am3d="http://schemas.microsoft.com/office/drawing/2017/model3d" xmlns:o="urn:schemas-microsoft-com:office:office" xmlns:oel="http://schemas.microsoft.com/office/2019/extlst" xmlns:r="http://schemas.openxmlformats.org/officeDocument/2006/relationships" xmlns:m="http://schemas.openxmlformats.org/officeDocument/2006/math" xmlns:v="urn:schemas-microsoft-com:vml" xmlns:wp14="http://schemas.microsoft.com/office/word/2010/wordprocessingDrawing" xmlns:wp="http://schemas.openxmlformats.org/drawingml/2006/wordprocessingDrawing" xmlns:w10="urn:schemas-microsoft-com:office:word" xmlns:w="http://schemas.openxmlformats.org/wordprocessingml/2006/main" xmlns:w14="http://schemas.microsoft.com/office/word/2010/wordml" xmlns:w15="http://schemas.microsoft.com/office/word/2012/wordml" xmlns:w16cex="http://schemas.microsoft.com/office/word/2018/wordml/cex" xmlns:w16cid="http://schemas.microsoft.com/office/word/2016/wordml/cid" xmlns:w16="http://schemas.microsoft.com/office/word/2018/wordml" xmlns:w16du="http://schemas.microsoft.com/office/word/2023/wordml/word16du" xmlns:w16sdtdh="http://schemas.microsoft.com/office/word/2020/wordml/sdtdatahash" xmlns:w16sdtfl="http://schemas.microsoft.com/office/word/2024/wordml/sdtformatlock" xmlns:w16se="http://schemas.microsoft.com/office/word/2015/wordml/symex" xmlns:wpg="http://schemas.microsoft.com/office/word/2010/wordprocessingGroup" xmlns:wpi="http://schemas.microsoft.com/office/word/2010/wordprocessingInk" xmlns:wne="http://schemas.microsoft.com/office/word/2006/wordml" xmlns:wps="http://schemas.microsoft.com/office/word/2010/wordprocessingShape" mc:Ignorable="w14 w15 w16se w16cid w16 w16cex w16sdtdh w16sdtfl w16du wp14">
+  <w:p>
+    <w:pPr>
+      <w:pStyle w:val="Footer"/>
+    </w:pPr>
+  </w:p>
+</w:ftr>
+</file>
+
+<file path=word/footnotes.xml><?xml version="1.0" encoding="utf-8"?>
+<w:footnotes xmlns:wpc="http://schemas.microsoft.com/office/word/2010/wordprocessingCanvas" xmlns:cx="http://schemas.microsoft.com/office/drawing/2014/chartex" xmlns:cx1="http://schemas.microsoft.com/office/drawing/2015/9/8/chartex" xmlns:cx2="http://schemas.microsoft.com/office/drawing/2015/10/21/chartex" xmlns:cx3="http://schemas.microsoft.com/office/drawing/2016/5/9/chartex" xmlns:cx4="http://schemas.microsoft.com/office/drawing/2016/5/10/chartex" xmlns:cx5="http://schemas.microsoft.com/office/drawing/2016/5/11/chartex" xmlns:cx6="http://schemas.microsoft.com/office/drawing/2016/5/12/chartex" xmlns:cx7="http://schemas.microsoft.com/office/drawing/2016/5/13/chartex" xmlns:cx8="http://schemas.microsoft.com/office/drawing/2016/5/14/chartex" xmlns:mc="http://schemas.openxmlformats.org/markup-compatibility/2006" xmlns:aink="http://schemas.microsoft.com/office/drawing/2016/ink" xmlns:am3d="http://schemas.microsoft.com/office/drawing/2017/model3d" xmlns:o="urn:schemas-microsoft-com:office:office" xmlns:oel="http://schemas.microsoft.com/office/2019/extlst" xmlns:r="http://schemas.openxmlformats.org/officeDocument/2006/relationships" xmlns:m="http://schemas.openxmlformats.org/officeDocument/2006/math" xmlns:v="urn:schemas-microsoft-com:vml" xmlns:wp14="http://schemas.microsoft.com/office/word/2010/wordprocessingDrawing" xmlns:wp="http://schemas.openxmlformats.org/drawingml/2006/wordprocessingDrawing" xmlns:w10="urn:schemas-microsoft-com:office:word" xmlns:w="http://schemas.openxmlformats.org/wordprocessingml/2006/main" xmlns:w14="http://schemas.microsoft.com/office/word/2010/wordml" xmlns:w15="http://schemas.microsoft.com/office/word/2012/wordml" xmlns:w16cex="http://schemas.microsoft.com/office/word/2018/wordml/cex" xmlns:w16cid="http://schemas.microsoft.com/office/word/2016/wordml/cid" xmlns:w16="http://schemas.microsoft.com/office/word/2018/wordml" xmlns:w16du="http://schemas.microsoft.com/office/word/2023/wordml/word16du" xmlns:w16sdtdh="http://schemas.microsoft.com/office/word/2020/wordml/sdtdatahash" xmlns:w16sdtfl="http://schemas.microsoft.com/office/word/2024/wordml/sdtformatlock" xmlns:w16se="http://schemas.microsoft.com/office/word/2015/wordml/symex" xmlns:wpg="http://schemas.microsoft.com/office/word/2010/wordprocessingGroup" xmlns:wpi="http://schemas.microsoft.com/office/word/2010/wordprocessingInk" xmlns:wne="http://schemas.microsoft.com/office/word/2006/wordml" xmlns:wps="http://schemas.microsoft.com/office/word/2010/wordprocessingShape" mc:Ignorable="w14 w15 w16se w16cid w16 w16cex w16sdtdh w16sdtfl w16du wp14">
+  <w:footnote w:type="separator" w:id="-1">
+    <w:p>
+      <w:pPr>
+        <w:spacing w:after="0" w:line="240" w:lineRule="auto"/>
+      </w:pPr>
+      <w:r>
+        <w:separator/>
+      </w:r>
+    </w:p>
+  </w:footnote>
+  <w:footnote w:type="continuationSeparator" w:id="0">
+    <w:p>
+      <w:pPr>
+        <w:spacing w:after="0" w:line="240" w:lineRule="auto"/>
+      </w:pPr>
+      <w:r>
+        <w:continuationSeparator/>
+      </w:r>
+    </w:p>
+  </w:footnote>
+</w:footnotes>
+</file>
+
+<file path=word/header1.xml><?xml version="1.0" encoding="utf-8"?>
+<w:hdr xmlns:wpc="http://schemas.microsoft.com/office/word/2010/wordprocessingCanvas" xmlns:cx="http://schemas.microsoft.com/office/drawing/2014/chartex" xmlns:cx1="http://schemas.microsoft.com/office/drawing/2015/9/8/chartex" xmlns:cx2="http://schemas.microsoft.com/office/drawing/2015/10/21/chartex" xmlns:cx3="http://schemas.microsoft.com/office/drawing/2016/5/9/chartex" xmlns:cx4="http://schemas.microsoft.com/office/drawing/2016/5/10/chartex" xmlns:cx5="http://schemas.microsoft.com/office/drawing/2016/5/11/chartex" xmlns:cx6="http://schemas.microsoft.com/office/drawing/2016/5/12/chartex" xmlns:cx7="http://schemas.microsoft.com/office/drawing/2016/5/13/chartex" xmlns:cx8="http://schemas.microsoft.com/office/drawing/2016/5/14/chartex" xmlns:mc="http://schemas.openxmlformats.org/markup-compatibility/2006" xmlns:aink="http://schemas.microsoft.com/office/drawing/2016/ink" xmlns:am3d="http://schemas.microsoft.com/office/drawing/2017/model3d" xmlns:o="urn:schemas-microsoft-com:office:office" xmlns:oel="http://schemas.microsoft.com/office/2019/extlst" xmlns:r="http://schemas.openxmlformats.org/officeDocument/2006/relationships" xmlns:m="http://schemas.openxmlformats.org/officeDocument/2006/math" xmlns:v="urn:schemas-microsoft-com:vml" xmlns:wp14="http://schemas.microsoft.com/office/word/2010/wordprocessingDrawing" xmlns:wp="http://schemas.openxmlformats.org/drawingml/2006/wordprocessingDrawing" xmlns:w10="urn:schemas-microsoft-com:office:word" xmlns:w="http://schemas.openxmlformats.org/wordprocessingml/2006/main" xmlns:w14="http://schemas.microsoft.com/office/word/2010/wordml" xmlns:w15="http://schemas.microsoft.com/office/word/2012/wordml" xmlns:w16cex="http://schemas.microsoft.com/office/word/2018/wordml/cex" xmlns:w16cid="http://schemas.microsoft.com/office/word/2016/wordml/cid" xmlns:w16="http://schemas.microsoft.com/office/word/2018/wordml" xmlns:w16du="http://schemas.microsoft.com/office/word/2023/wordml/word16du" xmlns:w16sdtdh="http://schemas.microsoft.com/office/word/2020/wordml/sdtdatahash" xmlns:w16sdtfl="http://schemas.microsoft.com/office/word/2024/wordml/sdtformatlock" xmlns:w16se="http://schemas.microsoft.com/office/word/2015/wordml/symex" xmlns:wpg="http://schemas.microsoft.com/office/word/2010/wordprocessingGroup" xmlns:wpi="http://schemas.microsoft.com/office/word/2010/wordprocessingInk" xmlns:wne="http://schemas.microsoft.com/office/word/2006/wordml" xmlns:wps="http://schemas.microsoft.com/office/word/2010/wordprocessingShape" mc:Ignorable="w14 w15 w16se w16cid w16 w16cex w16sdtdh w16sdtfl w16du wp14">
+  <w:p>
+    <w:pPr>
+      <w:pStyle w:val="Header"/>
+    </w:pPr>
+  </w:p>
+</w:hdr>
+</file>
+
+<file path=word/header2.xml><?xml version="1.0" encoding="utf-8"?>
+<w:hdr xmlns:wpc="http://schemas.microsoft.com/office/word/2010/wordprocessingCanvas" xmlns:cx="http://schemas.microsoft.com/office/drawing/2014/chartex" xmlns:cx1="http://schemas.microsoft.com/office/drawing/2015/9/8/chartex" xmlns:cx2="http://schemas.microsoft.com/office/drawing/2015/10/21/chartex" xmlns:cx3="http://schemas.microsoft.com/office/drawing/2016/5/9/chartex" xmlns:cx4="http://schemas.microsoft.com/office/drawing/2016/5/10/chartex" xmlns:cx5="http://schemas.microsoft.com/office/drawing/2016/5/11/chartex" xmlns:cx6="http://schemas.microsoft.com/office/drawing/2016/5/12/chartex" xmlns:cx7="http://schemas.microsoft.com/office/drawing/2016/5/13/chartex" xmlns:cx8="http://schemas.microsoft.com/office/drawing/2016/5/14/chartex" xmlns:mc="http://schemas.openxmlformats.org/markup-compatibility/2006" xmlns:aink="http://schemas.microsoft.com/office/drawing/2016/ink" xmlns:am3d="http://schemas.microsoft.com/office/drawing/2017/model3d" xmlns:o="urn:schemas-microsoft-com:office:office" xmlns:oel="http://schemas.microsoft.com/office/2019/extlst" xmlns:r="http://schemas.openxmlformats.org/officeDocument/2006/relationships" xmlns:m="http://schemas.openxmlformats.org/officeDocument/2006/math" xmlns:v="urn:schemas-microsoft-com:vml" xmlns:wp14="http://schemas.microsoft.com/office/word/2010/wordprocessingDrawing" xmlns:wp="http://schemas.openxmlformats.org/drawingml/2006/wordprocessingDrawing" xmlns:w10="urn:schemas-microsoft-com:office:word" xmlns:w="http://schemas.openxmlformats.org/wordprocessingml/2006/main" xmlns:w14="http://schemas.microsoft.com/office/word/2010/wordml" xmlns:w15="http://schemas.microsoft.com/office/word/2012/wordml" xmlns:w16cex="http://schemas.microsoft.com/office/word/2018/wordml/cex" xmlns:w16cid="http://schemas.microsoft.com/office/word/2016/wordml/cid" xmlns:w16="http://schemas.microsoft.com/office/word/2018/wordml" xmlns:w16du="http://schemas.microsoft.com/office/word/2023/wordml/word16du" xmlns:w16sdtdh="http://schemas.microsoft.com/office/word/2020/wordml/sdtdatahash" xmlns:w16sdtfl="http://schemas.microsoft.com/office/word/2024/wordml/sdtformatlock" xmlns:w16se="http://schemas.microsoft.com/office/word/2015/wordml/symex" xmlns:wpg="http://schemas.microsoft.com/office/word/2010/wordprocessingGroup" xmlns:wpi="http://schemas.microsoft.com/office/word/2010/wordprocessingInk" xmlns:wne="http://schemas.microsoft.com/office/word/2006/wordml" xmlns:wps="http://schemas.microsoft.com/office/word/2010/wordprocessingShape" mc:Ignorable="w14 w15 w16se w16cid w16 w16cex w16sdtdh w16sdtfl w16du wp14">
+  <w:p>
+    <w:pPr>
+      <w:pStyle w:val="Header"/>
+    </w:pPr>
+  </w:p>
+</w:hdr>
+</file>
+
+<file path=word/header3.xml><?xml version="1.0" encoding="utf-8"?>
+<w:hdr xmlns:wpc="http://schemas.microsoft.com/office/word/2010/wordprocessingCanvas" xmlns:cx="http://schemas.microsoft.com/office/drawing/2014/chartex" xmlns:cx1="http://schemas.microsoft.com/office/drawing/2015/9/8/chartex" xmlns:cx2="http://schemas.microsoft.com/office/drawing/2015/10/21/chartex" xmlns:cx3="http://schemas.microsoft.com/office/drawing/2016/5/9/chartex" xmlns:cx4="http://schemas.microsoft.com/office/drawing/2016/5/10/chartex" xmlns:cx5="http://schemas.microsoft.com/office/drawing/2016/5/11/chartex" xmlns:cx6="http://schemas.microsoft.com/office/drawing/2016/5/12/chartex" xmlns:cx7="http://schemas.microsoft.com/office/drawing/2016/5/13/chartex" xmlns:cx8="http://schemas.microsoft.com/office/drawing/2016/5/14/chartex" xmlns:mc="http://schemas.openxmlformats.org/markup-compatibility/2006" xmlns:aink="http://schemas.microsoft.com/office/drawing/2016/ink" xmlns:am3d="http://schemas.microsoft.com/office/drawing/2017/model3d" xmlns:o="urn:schemas-microsoft-com:office:office" xmlns:oel="http://schemas.microsoft.com/office/2019/extlst" xmlns:r="http://schemas.openxmlformats.org/officeDocument/2006/relationships" xmlns:m="http://schemas.openxmlformats.org/officeDocument/2006/math" xmlns:v="urn:schemas-microsoft-com:vml" xmlns:wp14="http://schemas.microsoft.com/office/word/2010/wordprocessingDrawing" xmlns:wp="http://schemas.openxmlformats.org/drawingml/2006/wordprocessingDrawing" xmlns:w10="urn:schemas-microsoft-com:office:word" xmlns:w="http://schemas.openxmlformats.org/wordprocessingml/2006/main" xmlns:w14="http://schemas.microsoft.com/office/word/2010/wordml" xmlns:w15="http://schemas.microsoft.com/office/word/2012/wordml" xmlns:w16cex="http://schemas.microsoft.com/office/word/2018/wordml/cex" xmlns:w16cid="http://schemas.microsoft.com/office/word/2016/wordml/cid" xmlns:w16="http://schemas.microsoft.com/office/word/2018/wordml" xmlns:w16du="http://schemas.microsoft.com/office/word/2023/wordml/word16du" xmlns:w16sdtdh="http://schemas.microsoft.com/office/word/2020/wordml/sdtdatahash" xmlns:w16sdtfl="http://schemas.microsoft.com/office/word/2024/wordml/sdtformatlock" xmlns:w16se="http://schemas.microsoft.com/office/word/2015/wordml/symex" xmlns:wpg="http://schemas.microsoft.com/office/word/2010/wordprocessingGroup" xmlns:wpi="http://schemas.microsoft.com/office/word/2010/wordprocessingInk" xmlns:wne="http://schemas.microsoft.com/office/word/2006/wordml" xmlns:wps="http://schemas.microsoft.com/office/word/2010/wordprocessingShape" mc:Ignorable="w14 w15 w16se w16cid w16 w16cex w16sdtdh w16sdtfl w16du wp14">
+  <w:p>
+    <w:pPr>
+      <w:pStyle w:val="Header"/>
+    </w:pPr>
+  </w:p>
+</w:hdr>
 </file>
 
 <file path=word/numbering.xml><?xml version="1.0" encoding="utf-8"?>
@@ -2064,6 +2252,7 @@
   <w:style w:type="character" w:default="1" w:styleId="DefaultParagraphFont">
     <w:name w:val="Default Paragraph Font"/>
     <w:uiPriority w:val="1"/>
+    <w:semiHidden/>
     <w:unhideWhenUsed/>
   </w:style>
   <w:style w:type="table" w:default="1" w:styleId="TableNormal">
@@ -2230,6 +2419,58 @@
     <w:rPr>
       <w:color w:val="954F72" w:themeColor="followedHyperlink"/>
       <w:u w:val="single"/>
+    </w:rPr>
+  </w:style>
+  <w:style w:type="paragraph" w:styleId="Header">
+    <w:name w:val="header"/>
+    <w:basedOn w:val="Normal"/>
+    <w:link w:val="HeaderChar"/>
+    <w:uiPriority w:val="99"/>
+    <w:unhideWhenUsed/>
+    <w:rsid w:val="00A3379F"/>
+    <w:pPr>
+      <w:tabs>
+        <w:tab w:val="center" w:pos="4680"/>
+        <w:tab w:val="right" w:pos="9360"/>
+      </w:tabs>
+      <w:spacing w:after="0" w:line="240" w:lineRule="auto"/>
+    </w:pPr>
+  </w:style>
+  <w:style w:type="character" w:customStyle="1" w:styleId="HeaderChar">
+    <w:name w:val="Header Char"/>
+    <w:basedOn w:val="DefaultParagraphFont"/>
+    <w:link w:val="Header"/>
+    <w:uiPriority w:val="99"/>
+    <w:rsid w:val="00A3379F"/>
+    <w:rPr>
+      <w:rFonts w:ascii="Times New Roman" w:hAnsi="Times New Roman"/>
+      <w:sz w:val="24"/>
+    </w:rPr>
+  </w:style>
+  <w:style w:type="paragraph" w:styleId="Footer">
+    <w:name w:val="footer"/>
+    <w:basedOn w:val="Normal"/>
+    <w:link w:val="FooterChar"/>
+    <w:uiPriority w:val="99"/>
+    <w:unhideWhenUsed/>
+    <w:rsid w:val="00A3379F"/>
+    <w:pPr>
+      <w:tabs>
+        <w:tab w:val="center" w:pos="4680"/>
+        <w:tab w:val="right" w:pos="9360"/>
+      </w:tabs>
+      <w:spacing w:after="0" w:line="240" w:lineRule="auto"/>
+    </w:pPr>
+  </w:style>
+  <w:style w:type="character" w:customStyle="1" w:styleId="FooterChar">
+    <w:name w:val="Footer Char"/>
+    <w:basedOn w:val="DefaultParagraphFont"/>
+    <w:link w:val="Footer"/>
+    <w:uiPriority w:val="99"/>
+    <w:rsid w:val="00A3379F"/>
+    <w:rPr>
+      <w:rFonts w:ascii="Times New Roman" w:hAnsi="Times New Roman"/>
+      <w:sz w:val="24"/>
     </w:rPr>
   </w:style>
 </w:styles>
@@ -2528,4 +2769,26 @@
     </a:ext>
   </a:extLst>
 </a:theme>
+</file>
+
+<file path=word/webextensions/taskpanes.xml><?xml version="1.0" encoding="utf-8"?>
+<wetp:taskpanes xmlns:wetp="http://schemas.microsoft.com/office/webextensions/taskpanes/2010/11">
+  <wetp:taskpane dockstate="right" visibility="0" width="350" row="1">
+    <wetp:webextensionref xmlns:r="http://schemas.openxmlformats.org/officeDocument/2006/relationships" r:id="rId1"/>
+  </wetp:taskpane>
+</wetp:taskpanes>
+</file>
+
+<file path=word/webextensions/webextension1.xml><?xml version="1.0" encoding="utf-8"?>
+<we:webextension xmlns:we="http://schemas.microsoft.com/office/webextensions/webextension/2010/11" id="{7ECD1B16-E7DF-4265-A894-5740B008B445}">
+  <we:reference id="wa200010725" version="1.0.0.1" store="en-US" storeType="OMEX"/>
+  <we:alternateReferences>
+    <we:reference id="WA200010725" version="1.0.0.1" store="" storeType="OMEX"/>
+  </we:alternateReferences>
+  <we:properties>
+    <we:property name="claude.fileId" value="&quot;43449895-b120-4ec1-9c21-88141091c48b&quot;"/>
+  </we:properties>
+  <we:bindings/>
+  <we:snapshot xmlns:r="http://schemas.openxmlformats.org/officeDocument/2006/relationships"/>
+</we:webextension>
 </file>
</xml_diff>